<commit_message>
Knowledge - 5/9/2026 part 1
</commit_message>
<xml_diff>
--- a/Knowledge/2-Science/3-Social science/1-Linguistics/0-Intro to Linguistics/5-My Source/2-Linguistics Basics/1-Synesthesia/2-4-Grapheme–color synesthesia.docx
+++ b/Knowledge/2-Science/3-Social science/1-Linguistics/0-Intro to Linguistics/5-My Source/2-Linguistics Basics/1-Synesthesia/2-4-Grapheme–color synesthesia.docx
@@ -5062,276 +5062,348 @@
       </w:pPr>
       <w:r>
         <w:rPr>
-          <w:rFonts w:ascii="Arial" w:eastAsia="Arial" w:hAnsi="Arial"/>
-          <w:b/>
-          <w:bCs/>
-          <w:sz w:val="18"/>
-          <w:szCs w:val="18"/>
-          <w:highlight w:val="lightGray"/>
-        </w:rPr>
-        <w:t># Source: ScreenShots</w:t>
-      </w:r>
-      <w:r>
-        <w:rPr>
-          <w:rFonts w:ascii="Arial" w:eastAsia="Arial" w:hAnsi="Arial"/>
-          <w:sz w:val="18"/>
-          <w:szCs w:val="18"/>
-          <w:highlight w:val="lightGray"/>
-        </w:rPr>
-        <w:t xml:space="preserve"> </w:t>
-      </w:r>
-      <w:r>
-        <w:rPr>
-          <w:rFonts w:ascii="Arial" w:eastAsia="Arial" w:hAnsi="Arial"/>
-          <w:b/>
-          <w:bCs/>
-          <w:sz w:val="18"/>
-          <w:szCs w:val="18"/>
+          <w:rFonts w:ascii="Arial" w:hAnsi="Arial"/>
+          <w:b/>
+          <w:sz w:val="18"/>
+          <w:highlight w:val="lightGray"/>
+        </w:rPr>
+        <w:t xml:space="preserve"># Source: </w:t>
+      </w:r>
+      <w:r>
+        <w:rPr>
+          <w:rFonts w:ascii="Arial" w:hAnsi="Arial" w:eastAsia="Arial" w:cs="Arial"/>
+          <w:b/>
+          <w:i w:val="0"/>
+          <w:color w:val="000000"/>
+          <w:sz w:val="18"/>
+          <w:highlight w:val="lightGray"/>
+        </w:rPr>
+        <w:t>S</w:t>
+      </w:r>
+      <w:r>
+        <w:rPr>
+          <w:rFonts w:ascii="Arial" w:hAnsi="Arial" w:eastAsia="Arial" w:cs="Arial"/>
+          <w:b/>
+          <w:i w:val="0"/>
+          <w:color w:val="000000"/>
+          <w:sz w:val="18"/>
+          <w:highlight w:val="lightGray"/>
+        </w:rPr>
+        <w:t>c</w:t>
+      </w:r>
+      <w:r>
+        <w:rPr>
+          <w:rFonts w:ascii="Arial" w:hAnsi="Arial" w:eastAsia="Arial" w:cs="Arial"/>
+          <w:b/>
+          <w:i w:val="0"/>
+          <w:color w:val="000000"/>
+          <w:sz w:val="18"/>
+          <w:highlight w:val="lightGray"/>
+        </w:rPr>
+        <w:t>r</w:t>
+      </w:r>
+      <w:r>
+        <w:rPr>
+          <w:rFonts w:ascii="Arial" w:hAnsi="Arial" w:eastAsia="Arial" w:cs="Arial"/>
+          <w:b/>
+          <w:i w:val="0"/>
+          <w:color w:val="000000"/>
+          <w:sz w:val="18"/>
+          <w:highlight w:val="lightGray"/>
+        </w:rPr>
+        <w:t>e</w:t>
+      </w:r>
+      <w:r>
+        <w:rPr>
+          <w:rFonts w:ascii="Arial" w:hAnsi="Arial" w:eastAsia="Arial" w:cs="Arial"/>
+          <w:b/>
+          <w:i w:val="0"/>
+          <w:color w:val="000000"/>
+          <w:sz w:val="18"/>
+          <w:highlight w:val="lightGray"/>
+        </w:rPr>
+        <w:t>e</w:t>
+      </w:r>
+      <w:r>
+        <w:rPr>
+          <w:rFonts w:ascii="Arial" w:hAnsi="Arial" w:eastAsia="Arial" w:cs="Arial"/>
+          <w:b/>
+          <w:i w:val="0"/>
+          <w:color w:val="000000"/>
+          <w:sz w:val="18"/>
+          <w:highlight w:val="lightGray"/>
+        </w:rPr>
+        <w:t>n</w:t>
+      </w:r>
+      <w:r>
+        <w:rPr>
+          <w:rFonts w:ascii="Arial" w:hAnsi="Arial" w:eastAsia="Arial" w:cs="Arial"/>
+          <w:b/>
+          <w:i w:val="0"/>
+          <w:color w:val="000000"/>
+          <w:sz w:val="18"/>
+          <w:highlight w:val="lightGray"/>
+        </w:rPr>
+        <w:t>S</w:t>
+      </w:r>
+      <w:r>
+        <w:rPr>
+          <w:rFonts w:ascii="Arial" w:hAnsi="Arial" w:eastAsia="Arial" w:cs="Arial"/>
+          <w:b/>
+          <w:i w:val="0"/>
+          <w:color w:val="000000"/>
+          <w:sz w:val="18"/>
+          <w:highlight w:val="lightGray"/>
+        </w:rPr>
+        <w:t>h</w:t>
+      </w:r>
+      <w:r>
+        <w:rPr>
+          <w:rFonts w:ascii="Arial" w:hAnsi="Arial" w:eastAsia="Arial" w:cs="Arial"/>
+          <w:b/>
+          <w:i w:val="0"/>
+          <w:color w:val="000000"/>
+          <w:sz w:val="18"/>
+          <w:highlight w:val="lightGray"/>
+        </w:rPr>
+        <w:t>o</w:t>
+      </w:r>
+      <w:r>
+        <w:rPr>
+          <w:rFonts w:ascii="Arial" w:hAnsi="Arial" w:eastAsia="Arial" w:cs="Arial"/>
+          <w:b/>
+          <w:i w:val="0"/>
+          <w:color w:val="000000"/>
+          <w:sz w:val="18"/>
+          <w:highlight w:val="lightGray"/>
+        </w:rPr>
+        <w:t>t</w:t>
+      </w:r>
+      <w:r>
+        <w:rPr>
+          <w:rFonts w:ascii="Arial" w:hAnsi="Arial"/>
+          <w:sz w:val="18"/>
+          <w:highlight w:val="lightGray"/>
+        </w:rPr>
+        <w:t xml:space="preserve"> </w:t>
+      </w:r>
+      <w:r>
+        <w:rPr>
+          <w:rFonts w:ascii="Arial" w:hAnsi="Arial"/>
+          <w:b/>
+          <w:sz w:val="18"/>
           <w:highlight w:val="lightGray"/>
         </w:rPr>
         <w:t>Source</w:t>
       </w:r>
       <w:r>
         <w:rPr>
-          <w:rFonts w:ascii="Arial" w:eastAsia="Arial" w:hAnsi="Arial"/>
-          <w:sz w:val="18"/>
-          <w:szCs w:val="18"/>
+          <w:rFonts w:ascii="Arial" w:hAnsi="Arial"/>
+          <w:sz w:val="18"/>
           <w:highlight w:val="lightGray"/>
         </w:rPr>
         <w:t xml:space="preserve">: </w:t>
       </w:r>
       <w:r>
         <w:rPr>
-          <w:rFonts w:ascii="Arial" w:eastAsia="Arial" w:hAnsi="Arial"/>
-          <w:b/>
-          <w:bCs/>
-          <w:sz w:val="18"/>
-          <w:szCs w:val="18"/>
+          <w:rFonts w:ascii="Arial" w:hAnsi="Arial"/>
+          <w:b/>
+          <w:sz w:val="18"/>
           <w:highlight w:val="lightGray"/>
         </w:rPr>
         <w:t>Provided by:</w:t>
       </w:r>
       <w:r>
         <w:rPr>
-          <w:rFonts w:ascii="Arial" w:eastAsia="Arial" w:hAnsi="Arial"/>
-          <w:sz w:val="18"/>
-          <w:szCs w:val="18"/>
+          <w:rFonts w:ascii="Arial" w:hAnsi="Arial"/>
+          <w:sz w:val="18"/>
           <w:highlight w:val="lightGray"/>
         </w:rPr>
         <w:t xml:space="preserve"> [Persons Table -&gt; ID Column: 1, Name_En Column: Motasem Essam] -&gt; </w:t>
       </w:r>
       <w:r>
         <w:rPr>
-          <w:rFonts w:ascii="Arial" w:eastAsia="Arial" w:hAnsi="Arial"/>
-          <w:b/>
-          <w:bCs/>
-          <w:sz w:val="18"/>
-          <w:szCs w:val="18"/>
+          <w:rFonts w:ascii="Arial" w:hAnsi="Arial"/>
+          <w:b/>
+          <w:sz w:val="18"/>
           <w:highlight w:val="lightGray"/>
         </w:rPr>
         <w:t>Tool:</w:t>
       </w:r>
       <w:r>
         <w:rPr>
-          <w:rFonts w:ascii="Arial" w:eastAsia="Arial" w:hAnsi="Arial"/>
-          <w:sz w:val="18"/>
-          <w:szCs w:val="18"/>
+          <w:rFonts w:ascii="Arial" w:hAnsi="Arial"/>
+          <w:sz w:val="18"/>
           <w:highlight w:val="lightGray"/>
         </w:rPr>
         <w:t xml:space="preserve"> [Lightshot Program] -&gt; </w:t>
       </w:r>
       <w:r>
         <w:rPr>
-          <w:rFonts w:ascii="Arial" w:eastAsia="Arial" w:hAnsi="Arial"/>
-          <w:b/>
-          <w:bCs/>
-          <w:sz w:val="18"/>
-          <w:szCs w:val="18"/>
+          <w:rFonts w:ascii="Arial" w:hAnsi="Arial"/>
+          <w:b/>
+          <w:sz w:val="18"/>
           <w:highlight w:val="lightGray"/>
         </w:rPr>
         <w:t xml:space="preserve">From </w:t>
       </w:r>
       <w:r>
         <w:rPr>
-          <w:rFonts w:ascii="Arial" w:eastAsia="Arial" w:hAnsi="Arial"/>
-          <w:sz w:val="18"/>
-          <w:szCs w:val="18"/>
+          <w:rFonts w:ascii="Arial" w:hAnsi="Arial"/>
+          <w:sz w:val="18"/>
           <w:highlight w:val="lightGray"/>
         </w:rPr>
         <w:t>[</w:t>
       </w:r>
       <w:r>
         <w:rPr>
-          <w:rFonts w:ascii="Arial" w:eastAsia="Arial" w:hAnsi="Arial"/>
-          <w:b/>
-          <w:bCs/>
-          <w:color w:val="000000" w:themeColor="text1"/>
-          <w:sz w:val="18"/>
-          <w:szCs w:val="18"/>
+          <w:rFonts w:ascii="Arial" w:hAnsi="Arial"/>
+          <w:b/>
+          <w:color w:val="000000"/>
+          <w:sz w:val="18"/>
           <w:highlight w:val="lightGray"/>
         </w:rPr>
         <w:t>Data Path</w:t>
       </w:r>
       <w:r>
         <w:rPr>
-          <w:rFonts w:ascii="Arial" w:eastAsia="Arial" w:hAnsi="Arial"/>
-          <w:color w:val="000000" w:themeColor="text1"/>
-          <w:sz w:val="18"/>
-          <w:szCs w:val="18"/>
+          <w:rFonts w:ascii="Arial" w:hAnsi="Arial"/>
+          <w:color w:val="000000"/>
+          <w:sz w:val="18"/>
           <w:highlight w:val="lightGray"/>
         </w:rPr>
         <w:t xml:space="preserve">: Sources Table -&gt; ID Column: 96, Content Title </w:t>
       </w:r>
       <w:r>
         <w:rPr>
-          <w:rFonts w:ascii="Arial" w:eastAsia="Arial" w:hAnsi="Arial"/>
-          <w:sz w:val="18"/>
-          <w:szCs w:val="18"/>
+          <w:rFonts w:ascii="Arial" w:hAnsi="Arial"/>
+          <w:sz w:val="18"/>
           <w:highlight w:val="lightGray"/>
         </w:rPr>
         <w:t>Column</w:t>
       </w:r>
       <w:r>
         <w:rPr>
-          <w:rFonts w:ascii="Arial" w:eastAsia="Arial" w:hAnsi="Arial"/>
-          <w:color w:val="000000" w:themeColor="text1"/>
-          <w:sz w:val="18"/>
-          <w:szCs w:val="18"/>
+          <w:rFonts w:ascii="Arial" w:hAnsi="Arial"/>
+          <w:color w:val="000000"/>
+          <w:sz w:val="18"/>
           <w:highlight w:val="lightGray"/>
         </w:rPr>
         <w:t>: Wiki Source - Grapheme–color synesthesia</w:t>
       </w:r>
       <w:r>
         <w:rPr>
-          <w:rFonts w:ascii="Arial" w:eastAsia="Arial" w:hAnsi="Arial"/>
-          <w:sz w:val="18"/>
-          <w:szCs w:val="18"/>
-          <w:highlight w:val="lightGray"/>
-        </w:rPr>
-        <w:t xml:space="preserve"> </w:t>
-      </w:r>
-      <w:r>
-        <w:rPr>
-          <w:rFonts w:ascii="Arial" w:eastAsia="Arial" w:hAnsi="Arial"/>
-          <w:b/>
-          <w:bCs/>
-          <w:color w:val="000000" w:themeColor="text1"/>
-          <w:sz w:val="18"/>
-          <w:szCs w:val="18"/>
+          <w:rFonts w:ascii="Arial" w:hAnsi="Arial"/>
+          <w:sz w:val="18"/>
+          <w:highlight w:val="lightGray"/>
+        </w:rPr>
+        <w:t xml:space="preserve"> </w:t>
+      </w:r>
+      <w:r>
+        <w:rPr>
+          <w:rFonts w:ascii="Arial" w:hAnsi="Arial"/>
+          <w:b/>
+          <w:color w:val="000000"/>
+          <w:sz w:val="18"/>
           <w:highlight w:val="lightGray"/>
         </w:rPr>
         <w:t>at</w:t>
       </w:r>
       <w:r>
         <w:rPr>
-          <w:rFonts w:ascii="Arial" w:eastAsia="Arial" w:hAnsi="Arial"/>
-          <w:color w:val="000000" w:themeColor="text1"/>
-          <w:sz w:val="18"/>
-          <w:szCs w:val="18"/>
+          <w:rFonts w:ascii="Arial" w:hAnsi="Arial"/>
+          <w:color w:val="000000"/>
+          <w:sz w:val="18"/>
           <w:highlight w:val="lightGray"/>
         </w:rPr>
         <w:t>: [</w:t>
       </w:r>
       <w:r>
         <w:rPr>
-          <w:rFonts w:ascii="Arial" w:eastAsia="Arial" w:hAnsi="Arial"/>
-          <w:sz w:val="18"/>
-          <w:szCs w:val="18"/>
+          <w:rFonts w:ascii="Arial" w:hAnsi="Arial"/>
+          <w:sz w:val="18"/>
           <w:highlight w:val="lightGray"/>
         </w:rPr>
         <w:t xml:space="preserve">Document, </w:t>
       </w:r>
       <w:r>
         <w:rPr>
-          <w:rFonts w:ascii="Arial" w:eastAsia="Arial" w:hAnsi="Arial"/>
-          <w:color w:val="000000" w:themeColor="text1"/>
-          <w:sz w:val="18"/>
-          <w:szCs w:val="18"/>
+          <w:rFonts w:ascii="Arial" w:hAnsi="Arial"/>
+          <w:color w:val="000000"/>
+          <w:sz w:val="18"/>
           <w:highlight w:val="lightGray"/>
         </w:rPr>
         <w:t>page: 1, Top</w:t>
       </w:r>
       <w:r>
         <w:rPr>
-          <w:rFonts w:ascii="Arial" w:eastAsia="Arial" w:hAnsi="Arial"/>
-          <w:sz w:val="18"/>
-          <w:szCs w:val="18"/>
+          <w:rFonts w:ascii="Arial" w:hAnsi="Arial"/>
+          <w:sz w:val="18"/>
           <w:highlight w:val="lightGray"/>
         </w:rPr>
         <w:t xml:space="preserve">] </w:t>
       </w:r>
       <w:r>
         <w:rPr>
-          <w:rFonts w:ascii="Arial" w:eastAsia="Arial" w:hAnsi="Arial"/>
-          <w:b/>
-          <w:bCs/>
-          <w:sz w:val="18"/>
-          <w:szCs w:val="18"/>
+          <w:rFonts w:ascii="Arial" w:hAnsi="Arial"/>
+          <w:b/>
+          <w:sz w:val="18"/>
           <w:highlight w:val="lightGray"/>
         </w:rPr>
         <w:t>on</w:t>
       </w:r>
       <w:r>
         <w:rPr>
-          <w:rFonts w:ascii="Arial" w:eastAsia="Arial" w:hAnsi="Arial"/>
-          <w:sz w:val="18"/>
-          <w:szCs w:val="18"/>
+          <w:rFonts w:ascii="Arial" w:hAnsi="Arial"/>
+          <w:sz w:val="18"/>
           <w:highlight w:val="lightGray"/>
         </w:rPr>
         <w:t xml:space="preserve"> [</w:t>
       </w:r>
       <w:r>
         <w:rPr>
-          <w:rFonts w:ascii="Arial" w:eastAsia="Arial" w:hAnsi="Arial" w:hint="cs"/>
-          <w:sz w:val="18"/>
-          <w:szCs w:val="18"/>
-          <w:highlight w:val="lightGray"/>
-          <w:rtl/>
+          <w:rFonts w:ascii="Arial" w:hAnsi="Arial"/>
+          <w:sz w:val="18"/>
+          <w:highlight w:val="lightGray"/>
         </w:rPr>
         <w:t>7</w:t>
       </w:r>
       <w:r>
         <w:rPr>
-          <w:rFonts w:ascii="Arial" w:eastAsia="Arial" w:hAnsi="Arial"/>
-          <w:sz w:val="18"/>
-          <w:szCs w:val="18"/>
+          <w:rFonts w:ascii="Arial" w:hAnsi="Arial"/>
+          <w:sz w:val="18"/>
           <w:highlight w:val="lightGray"/>
         </w:rPr>
         <w:t>/2</w:t>
       </w:r>
       <w:r>
         <w:rPr>
-          <w:rFonts w:ascii="Arial" w:eastAsia="Arial" w:hAnsi="Arial"/>
-          <w:sz w:val="18"/>
-          <w:szCs w:val="18"/>
+          <w:rFonts w:ascii="Arial" w:hAnsi="Arial"/>
+          <w:sz w:val="18"/>
           <w:highlight w:val="lightGray"/>
         </w:rPr>
         <w:t>4</w:t>
       </w:r>
       <w:r>
         <w:rPr>
-          <w:rFonts w:ascii="Arial" w:eastAsia="Arial" w:hAnsi="Arial"/>
-          <w:sz w:val="18"/>
-          <w:szCs w:val="18"/>
+          <w:rFonts w:ascii="Arial" w:hAnsi="Arial"/>
+          <w:sz w:val="18"/>
           <w:highlight w:val="lightGray"/>
         </w:rPr>
         <w:t>/202</w:t>
       </w:r>
       <w:r>
         <w:rPr>
-          <w:rFonts w:ascii="Arial" w:eastAsia="Arial" w:hAnsi="Arial" w:hint="cs"/>
-          <w:sz w:val="18"/>
-          <w:szCs w:val="18"/>
-          <w:highlight w:val="lightGray"/>
-          <w:rtl/>
+          <w:rFonts w:ascii="Arial" w:hAnsi="Arial"/>
+          <w:sz w:val="18"/>
+          <w:highlight w:val="lightGray"/>
         </w:rPr>
         <w:t>5</w:t>
       </w:r>
       <w:r>
         <w:rPr>
-          <w:rFonts w:ascii="Arial" w:eastAsia="Arial" w:hAnsi="Arial"/>
-          <w:sz w:val="18"/>
-          <w:szCs w:val="18"/>
+          <w:rFonts w:ascii="Arial" w:hAnsi="Arial"/>
+          <w:sz w:val="18"/>
           <w:highlight w:val="lightGray"/>
         </w:rPr>
         <w:t>]</w:t>

</xml_diff>